<commit_message>
docs: laporan status v2 (NF2FF terverifikasi, skor v2, 162 test)
</commit_message>
<xml_diff>
--- a/docs/laporan-status-yotta-2026-09-21.docx
+++ b/docs/laporan-status-yotta-2026-09-21.docx
@@ -15,7 +15,7 @@
         <w:jc w:val="left"/>
       </w:pPr>
       <w:r>
-        <w:t>Disusun oleh Yotta (peran: verifikasi &amp; analisis independen) · 2026-09-21 · snapshot main @ c96dd8d3</w:t>
+        <w:t>Disusun oleh Yotta (peran: verifikasi &amp; analisis independen) · 2026-09-22 · snapshot main @ 9987f514 · 162 test lulus</w:t>
       </w:r>
     </w:p>
     <w:p>
@@ -64,6 +64,14 @@
       </w:pPr>
       <w:r>
         <w:t>Penghalang terbesar untuk dipakai sebagai otoritas fabrikasi: bias konstruksi sisa, realisasi feed (probe vs inset coplanar), dan loss yang belum divalidasi.</w:t>
+      </w:r>
+    </w:p>
+    <w:p>
+      <w:pPr>
+        <w:pStyle w:val="ListBullet"/>
+      </w:pPr>
+      <w:r>
+        <w:t>NF2FF (near-to-far-field) kini tersedia di generator — terverifikasi statis oleh Yotta — sehingga pola/gain dari solver mulai bisa diambil; pengambilan end-to-end belum dijalankan.</w:t>
       </w:r>
     </w:p>
     <w:p>
@@ -1312,7 +1320,39 @@
         <w:pStyle w:val="Heading1"/>
       </w:pPr>
       <w:r>
-        <w:t>10. Berkas rujukan di repo</w:t>
+        <w:t>10. Verifikasi NF2FF (A-2) — lulus statis, dua catatan</w:t>
+      </w:r>
+    </w:p>
+    <w:p>
+      <w:pPr>
+        <w:pStyle w:val="ListBullet"/>
+      </w:pPr>
+      <w:r>
+        <w:t>Terverifikasi: kotak NF2FF dibuat setelah mesh (ada test orde), bounds eksplisit, manifest mencatat nf2ff/nf2ff_frequencies, tulis nf2ff_summary.csv + nf2ff_pattern.csv, knob A/B teruji.</w:t>
+      </w:r>
+    </w:p>
+    <w:p>
+      <w:pPr>
+        <w:pStyle w:val="ListBullet"/>
+      </w:pPr>
+      <w:r>
+        <w:t>Catatan 1: belum ada run end-to-end maupun differential run (S11 harus tidak berubah saat NF2FF aktif) — butuh openEMS.</w:t>
+      </w:r>
+    </w:p>
+    <w:p>
+      <w:pPr>
+        <w:pStyle w:val="ListBullet"/>
+      </w:pPr>
+      <w:r>
+        <w:t>Catatan 2: default margin udara berubah 0,20 → 0,80 λ0 (alasan benar: penyerap butuh jarak), tetapi itu perubahan numerik default yang menggeser baseline semua perbandingan terdahulu — wajib differential run + catatan di docs/verification.md.</w:t>
+      </w:r>
+    </w:p>
+    <w:p>
+      <w:pPr>
+        <w:pStyle w:val="Heading1"/>
+      </w:pPr>
+      <w:r>
+        <w:t>11. Berkas rujukan di repo</w:t>
       </w:r>
     </w:p>
     <w:p>

</xml_diff>